<commit_message>
Add GitHub repository screenshot
</commit_message>
<xml_diff>
--- a/module-1/Shrestha-Assignment1_2.docx
+++ b/module-1/Shrestha-Assignment1_2.docx
@@ -84,6 +84,9 @@
         <w:pStyle w:val="ListParagraph"/>
       </w:pPr>
       <w:r>
+        <w:rPr>
+          <w:noProof/>
+        </w:rPr>
         <w:drawing>
           <wp:inline distT="0" distB="0" distL="0" distR="0" wp14:anchorId="315ED4D2" wp14:editId="1E1746B2">
             <wp:extent cx="4286281" cy="1009657"/>
@@ -176,19 +179,7 @@
           <w:rPr>
             <w:rStyle w:val="Hyperlink"/>
           </w:rPr>
-          <w:t>https://github.com/RockyShre</w:t>
-        </w:r>
-        <w:r>
-          <w:rPr>
-            <w:rStyle w:val="Hyperlink"/>
-          </w:rPr>
-          <w:t>s</w:t>
-        </w:r>
-        <w:r>
-          <w:rPr>
-            <w:rStyle w:val="Hyperlink"/>
-          </w:rPr>
-          <w:t>tha/csd-325.git</w:t>
+          <w:t>https://github.com/RockyShrestha/csd-325</w:t>
         </w:r>
       </w:hyperlink>
     </w:p>
@@ -234,10 +225,55 @@
           <w:bCs/>
         </w:rPr>
       </w:pPr>
+      <w:r>
+        <w:rPr>
+          <w:b/>
+          <w:bCs/>
+        </w:rPr>
+        <w:drawing>
+          <wp:inline distT="0" distB="0" distL="0" distR="0" wp14:anchorId="5ABA0F7B" wp14:editId="6425587A">
+            <wp:extent cx="5943600" cy="2825115"/>
+            <wp:effectExtent l="0" t="0" r="0" b="0"/>
+            <wp:docPr id="335702861" name="Picture 1"/>
+            <wp:cNvGraphicFramePr>
+              <a:graphicFrameLocks xmlns:a="http://schemas.openxmlformats.org/drawingml/2006/main" noChangeAspect="1"/>
+            </wp:cNvGraphicFramePr>
+            <a:graphic xmlns:a="http://schemas.openxmlformats.org/drawingml/2006/main">
+              <a:graphicData uri="http://schemas.openxmlformats.org/drawingml/2006/picture">
+                <pic:pic xmlns:pic="http://schemas.openxmlformats.org/drawingml/2006/picture">
+                  <pic:nvPicPr>
+                    <pic:cNvPr id="335702861" name=""/>
+                    <pic:cNvPicPr/>
+                  </pic:nvPicPr>
+                  <pic:blipFill>
+                    <a:blip r:embed="rId7"/>
+                    <a:stretch>
+                      <a:fillRect/>
+                    </a:stretch>
+                  </pic:blipFill>
+                  <pic:spPr>
+                    <a:xfrm>
+                      <a:off x="0" y="0"/>
+                      <a:ext cx="5943600" cy="2825115"/>
+                    </a:xfrm>
+                    <a:prstGeom prst="rect">
+                      <a:avLst/>
+                    </a:prstGeom>
+                  </pic:spPr>
+                </pic:pic>
+              </a:graphicData>
+            </a:graphic>
+          </wp:inline>
+        </w:drawing>
+      </w:r>
     </w:p>
     <w:p>
       <w:pPr>
         <w:ind w:left="720"/>
+        <w:rPr>
+          <w:i/>
+          <w:iCs/>
+        </w:rPr>
       </w:pPr>
       <w:r>
         <w:rPr>
@@ -260,6 +296,11 @@
         </w:rPr>
         <w:t xml:space="preserve"> GitHub repository.</w:t>
       </w:r>
+    </w:p>
+    <w:p>
+      <w:pPr>
+        <w:ind w:left="720"/>
+      </w:pPr>
     </w:p>
     <w:p>
       <w:pPr>
@@ -274,6 +315,7 @@
           <w:b/>
           <w:bCs/>
         </w:rPr>
+        <w:lastRenderedPageBreak/>
         <w:t>Local Directory Screenshot</w:t>
       </w:r>
     </w:p>
@@ -291,6 +333,9 @@
         </w:rPr>
       </w:pPr>
       <w:r>
+        <w:rPr>
+          <w:noProof/>
+        </w:rPr>
         <w:drawing>
           <wp:inline distT="0" distB="0" distL="0" distR="0" wp14:anchorId="658B5767" wp14:editId="2DA508D3">
             <wp:extent cx="4933986" cy="1752613"/>
@@ -307,7 +352,7 @@
                     <pic:cNvPicPr/>
                   </pic:nvPicPr>
                   <pic:blipFill>
-                    <a:blip r:embed="rId7"/>
+                    <a:blip r:embed="rId8"/>
                     <a:stretch>
                       <a:fillRect/>
                     </a:stretch>
@@ -352,6 +397,13 @@
           <w:iCs/>
         </w:rPr>
         <w:t xml:space="preserve"> directory showing the module-1 folder</w:t>
+      </w:r>
+      <w:r>
+        <w:rPr>
+          <w:i/>
+          <w:iCs/>
+        </w:rPr>
+        <w:t>.</w:t>
       </w:r>
     </w:p>
     <w:sectPr>

</xml_diff>